<commit_message>
Roteiro Elvis: gancho mais forte
Co-Authored-By: Claude Opus 5.5 <noreply@anthropic.com>
Claude-Session: https://claude.ai/code/session_01MJjUEEZrxQDEUifKK2vj9g
</commit_message>
<xml_diff>
--- a/roteiros/elvis/Elvis_Parte1_Introducao.docx
+++ b/roteiros/elvis/Elvis_Parte1_Introducao.docx
@@ -15,7 +15,7 @@
         <w:rPr>
           <w:color w:val="C00000"/>
         </w:rPr>
-        <w:t>Elvis Presley foi o homem mais famoso do planeta e nunca fez um único show na Europa. O motivo estava escondido no passado do homem que controlava cada passo dele.</w:t>
+        <w:t>Elvis Presley morreu sem receber mais um centavo pelos maiores sucessos da própria vida. E o homem que tirou isso dele escondia um segredo tão sujo que nem o próprio Elvis sabia quem ele era de verdade.</w:t>
       </w:r>
     </w:p>
     <w:p>
@@ -23,7 +23,7 @@
         <w:rPr>
           <w:color w:val="C00000"/>
         </w:rPr>
-        <w:t>Um segredo sujo, guardado por décadas, que custou ao Rei a liberdade e metade de tudo o que ele ganhou.</w:t>
+        <w:t>Um segredo que prendeu o Rei dentro do próprio país e levou metade de tudo o que ele ganhou.</w:t>
       </w:r>
     </w:p>
     <w:p>
@@ -31,7 +31,7 @@
         <w:rPr>
           <w:color w:val="C00000"/>
         </w:rPr>
-        <w:t>Fique até o final, porque você vai descobrir quem era de verdade esse homem. E por que ninguém ao redor de Elvis teve coragem de detê-lo.</w:t>
+        <w:t>Fique até o final, porque você vai descobrir quem era esse homem. E por que ninguém ao redor de Elvis teve coragem de detê-lo.</w:t>
       </w:r>
     </w:p>
     <w:p>

</xml_diff>

<commit_message>
Roteiro Elvis: volta ao gancho original
Co-Authored-By: Claude Opus 5.5 <noreply@anthropic.com>
Claude-Session: https://claude.ai/code/session_01MJjUEEZrxQDEUifKK2vj9g
</commit_message>
<xml_diff>
--- a/roteiros/elvis/Elvis_Parte1_Introducao.docx
+++ b/roteiros/elvis/Elvis_Parte1_Introducao.docx
@@ -15,7 +15,7 @@
         <w:rPr>
           <w:color w:val="C00000"/>
         </w:rPr>
-        <w:t>Elvis Presley morreu sem receber mais um centavo pelos maiores sucessos da própria vida. E o homem que tirou isso dele escondia um segredo tão sujo que nem o próprio Elvis sabia quem ele era de verdade.</w:t>
+        <w:t>Elvis Presley foi o homem mais famoso do planeta e nunca fez um único show na Europa. O motivo estava escondido no passado do homem que controlava cada passo dele.</w:t>
       </w:r>
     </w:p>
     <w:p>
@@ -23,7 +23,7 @@
         <w:rPr>
           <w:color w:val="C00000"/>
         </w:rPr>
-        <w:t>Um segredo que prendeu o Rei dentro do próprio país e levou metade de tudo o que ele ganhou.</w:t>
+        <w:t>Um segredo sujo, guardado por décadas, que custou ao Rei a liberdade e metade de tudo o que ele ganhou.</w:t>
       </w:r>
     </w:p>
     <w:p>
@@ -31,7 +31,7 @@
         <w:rPr>
           <w:color w:val="C00000"/>
         </w:rPr>
-        <w:t>Fique até o final, porque você vai descobrir quem era esse homem. E por que ninguém ao redor de Elvis teve coragem de detê-lo.</w:t>
+        <w:t>Fique até o final, porque você vai descobrir quem era de verdade esse homem. E por que ninguém ao redor de Elvis teve coragem de detê-lo.</w:t>
       </w:r>
     </w:p>
     <w:p>

</xml_diff>

<commit_message>
Roteiro Elvis: revisão da parte 1
Co-Authored-By: Claude Opus 5.5 <noreply@anthropic.com>
Claude-Session: https://claude.ai/code/session_01MJjUEEZrxQDEUifKK2vj9g
</commit_message>
<xml_diff>
--- a/roteiros/elvis/Elvis_Parte1_Introducao.docx
+++ b/roteiros/elvis/Elvis_Parte1_Introducao.docx
@@ -23,7 +23,7 @@
         <w:rPr>
           <w:color w:val="C00000"/>
         </w:rPr>
-        <w:t>Um segredo sujo, guardado por décadas, que custou ao Rei a liberdade e metade de tudo o que ele ganhou.</w:t>
+        <w:t>Um segredo sujo, guardado por décadas, que custou ao Rei a liberdade e até metade do dinheiro que ele ganhava.</w:t>
       </w:r>
     </w:p>
     <w:p>
@@ -71,7 +71,7 @@
         <w:rPr>
           <w:color w:val="000000"/>
         </w:rPr>
-        <w:t>A casa tinha sido construída pelo próprio marido dela, Vernon, com dinheiro emprestado. Dois cômodos. Chão de tábua. Nenhum luxo.</w:t>
+        <w:t>A casa tinha sido construída pelo próprio marido dela, Vernon, com dinheiro emprestado. Dois cômodos e chão de tábua.</w:t>
       </w:r>
     </w:p>
     <w:p>
@@ -127,7 +127,7 @@
         <w:rPr>
           <w:color w:val="000000"/>
         </w:rPr>
-        <w:t>Vernon pegava o trabalho que aparecesse. Gladys costurava, trabalhava em fábrica, fazia o que fosse preciso. Muitas vezes, não havia dinheiro para o básico.</w:t>
+        <w:t>Vernon pegava o trabalho que aparecesse. Gladys trabalhava como costureira numa fábrica. Muitas vezes, não havia dinheiro para o básico.</w:t>
       </w:r>
     </w:p>
     <w:p>
@@ -215,7 +215,7 @@
         <w:rPr>
           <w:color w:val="C00000"/>
         </w:rPr>
-        <w:t>Aqui é onde tudo muda. Porque um menino que cresce sem uma figura de autoridade firme aprende a procurar essa figura em outro lugar. E, vinte anos depois, alguém ia se oferecer para ocupar esse lugar. Com um sorriso, um charuto e um contrato na mão.</w:t>
+        <w:t>Aqui é onde tudo muda. Porque, vinte anos depois, alguém ia se oferecer para ocupar esse lugar vazio. Com um sorriso, um charuto e um contrato na mão.</w:t>
       </w:r>
     </w:p>
     <w:p>
@@ -279,7 +279,7 @@
         <w:rPr>
           <w:color w:val="000000"/>
         </w:rPr>
-        <w:t>Moraram em conjuntos habitacionais para famílias pobres. Elvis estudou na escola Humes, onde era tímido, calado e visto como esquisito pelos colegas, com o cabelo cheio de brilhantina e as roupas diferentes que comprava na rua Beale, a rua da música negra de Memphis.</w:t>
+        <w:t>Moraram em conjuntos habitacionais para famílias pobres. Elvis estudou na escola Humes, onde era tímido e visto como esquisito pelos colegas, com o cabelo cheio de brilhantina e as roupas diferentes que comprava na rua Beale, a rua da música negra de Memphis.</w:t>
       </w:r>
     </w:p>
     <w:p>
@@ -327,7 +327,7 @@
         <w:rPr>
           <w:color w:val="000000"/>
         </w:rPr>
-        <w:t>Em julho de mil novecentos e cinquenta e quatro, chamou Elvis para gravar de verdade. No meio de uma pausa, Elvis começou a brincar com uma música antiga de blues, "That's All Right", cantando rápido, se mexendo, rindo.</w:t>
+        <w:t>Em julho de mil novecentos e cinquenta e quatro, chamou Elvis para gravar de verdade. No meio de uma pausa, Elvis começou a brincar com uma música de blues de Arthur Crudup, "That's All Right", cantando rápido e rindo.</w:t>
       </w:r>
     </w:p>
     <w:p>
@@ -375,7 +375,7 @@
         <w:rPr>
           <w:color w:val="000000"/>
         </w:rPr>
-        <w:t>Entre essas pessoas, havia um homem gordo, de chapéu, que fumava charutos, falava com sotaque estranho e se apresentava como Coronel.</w:t>
+        <w:t>Entre essas pessoas, havia um homem gordo, de charuto na boca e sotaque estranho, que se apresentava como Coronel.</w:t>
       </w:r>
     </w:p>
     <w:p>

</xml_diff>

<commit_message>
Roteiro Elvis: revisão anti-IA e retenção
Co-Authored-By: Claude Opus 5.5 <noreply@anthropic.com>
Claude-Session: https://claude.ai/code/session_01MJjUEEZrxQDEUifKK2vj9g
</commit_message>
<xml_diff>
--- a/roteiros/elvis/Elvis_Parte1_Introducao.docx
+++ b/roteiros/elvis/Elvis_Parte1_Introducao.docx
@@ -135,7 +135,7 @@
         <w:rPr>
           <w:color w:val="000000"/>
         </w:rPr>
-        <w:t>E quando Elvis tinha três anos, o chão da família desabou.</w:t>
+        <w:t>Quando Elvis tinha três anos, o chão da família desabou.</w:t>
       </w:r>
     </w:p>
     <w:p>
@@ -367,7 +367,7 @@
         <w:rPr>
           <w:color w:val="000000"/>
         </w:rPr>
-        <w:t>E o sucesso começou a atrair gente de todo tipo.</w:t>
+        <w:t>O sucesso começou a atrair gente de todo tipo.</w:t>
       </w:r>
     </w:p>
     <w:p>

</xml_diff>